<commit_message>
feat(v3): add confused question marks and thinking cloud
Co-Authored-By: Claude Code <noreply@anthropic.com>
</commit_message>
<xml_diff>
--- a/experiment-3/ELO_Face_V3_Emotion_Reference.docx
+++ b/experiment-3/ELO_Face_V3_Emotion_Reference.docx
@@ -7061,7 +7061,7 @@
           <w:color w:val="0F172A"/>
           <w:sz w:val="28"/>
         </w:rPr>
-        <w:t>6. Confused (Puzzled Alternating Scan) (4.5s)</w:t>
+        <w:t>6. Confused (Puzzled Alternating Scan &amp; Question-Mark Accents) (4.5s)</w:t>
       </w:r>
     </w:p>
     <w:p>
@@ -7115,7 +7115,7 @@
           <w:color w:val="64748B"/>
           <w:sz w:val="17"/>
         </w:rPr>
-        <w:t>Figure 7: Live V3 Render — Confused (Puzzled Alternating Scan) (800x480 native resolution).</w:t>
+        <w:t>Figure 7: Live V3 Render — Confused (Puzzled Alternating Scan &amp; Question-Mark Accents) (800x480 native resolution).</w:t>
       </w:r>
     </w:p>
     <w:p>
@@ -7147,7 +7147,7 @@
         <w:rPr>
           <w:color w:val="334155"/>
         </w:rPr>
-        <w:t>A hesitant, alternating two-phase scanning pattern. In Phase 1, eyes shift left (dx = -34 px) with left-eye squint (o_L = 0.82, o_R = 1.0). The gaze pauses, hesitates back toward center, then shifts puzzled to the right (dx = +38 px, dy = +8 px) with right-eye squint (o_L = 1.0, o_R = 0.82).</w:t>
+        <w:t>A hesitant, alternating two-phase scanning pattern accompanied by signature question-mark visual accents floating above the eyes. In Phase 1, eyes shift left (dx = -34 px) with left-eye squint (o_L = 0.82, o_R = 1.0) while 3 balanced question marks fade in and float upward into position. The gaze pauses, hesitates back toward center, then shifts puzzled to the right (dx = +38 px, dy = +8 px) with right-eye squint (o_L = 1.0, o_R = 0.82) with subtle organic bobbing. At segment completion, the question marks dissolve cleanly with zero boundary leakage.</w:t>
       </w:r>
     </w:p>
     <w:tbl>
@@ -7261,7 +7261,7 @@
                 <w:color w:val="1E293B"/>
                 <w:sz w:val="18"/>
               </w:rPr>
-              <w:t>Alternating Asymmetry</w:t>
+              <w:t>Question-Mark Accents</w:t>
             </w:r>
           </w:p>
         </w:tc>
@@ -7294,7 +7294,7 @@
                 <w:color w:val="334155"/>
                 <w:sz w:val="18"/>
               </w:rPr>
-              <w:t>Phase 1: o_L=0.82, o_R=1.0 | Phase 2: o_L=1.0, o_R=0.82</w:t>
+              <w:t>3 balanced marks: Center (42pt, (400, 95)), Left (30pt, (305, 115)), Right (32pt, (495, 110))</w:t>
             </w:r>
           </w:p>
         </w:tc>
@@ -7330,7 +7330,7 @@
                 <w:color w:val="1E293B"/>
                 <w:sz w:val="18"/>
               </w:rPr>
-              <w:t>Gaze Pattern</w:t>
+              <w:t>Visual Envelope</w:t>
             </w:r>
           </w:p>
         </w:tc>
@@ -7363,7 +7363,7 @@
                 <w:color w:val="334155"/>
                 <w:sz w:val="18"/>
               </w:rPr>
-              <w:t>Left (-34 px) -&gt; Hesitate Center -&gt; Right (+38 px, +8 px)</w:t>
+              <w:t>Fade in &amp; rise (u &lt; 0.20) -&gt; Active hold &amp; bob (0.20-0.80) -&gt; Fade out (u &gt; 0.80)</w:t>
             </w:r>
           </w:p>
         </w:tc>
@@ -7399,7 +7399,7 @@
                 <w:color w:val="1E293B"/>
                 <w:sz w:val="18"/>
               </w:rPr>
-              <w:t>Scale Multiplier</w:t>
+              <w:t>Alternating Asymmetry</w:t>
             </w:r>
           </w:p>
         </w:tc>
@@ -7432,7 +7432,7 @@
                 <w:color w:val="334155"/>
                 <w:sz w:val="18"/>
               </w:rPr>
-              <w:t>1.00x</w:t>
+              <w:t>Phase 1: o_L=0.82, o_R=1.0 | Phase 2: o_L=1.0, o_R=0.82</w:t>
             </w:r>
           </w:p>
         </w:tc>
@@ -7468,7 +7468,7 @@
                 <w:color w:val="1E293B"/>
                 <w:sz w:val="18"/>
               </w:rPr>
-              <w:t>Phase 1 / Phase 2 Split</w:t>
+              <w:t>Gaze Pattern</w:t>
             </w:r>
           </w:p>
         </w:tc>
@@ -7501,7 +7501,7 @@
                 <w:color w:val="334155"/>
                 <w:sz w:val="18"/>
               </w:rPr>
-              <w:t>u in [0.0, 0.40] / u in [0.40, 0.80]</w:t>
+              <w:t>Left (-34 px) -&gt; Hesitate Center -&gt; Right (+38 px, +8 px)</w:t>
             </w:r>
           </w:p>
         </w:tc>
@@ -7537,7 +7537,7 @@
                 <w:color w:val="1E293B"/>
                 <w:sz w:val="18"/>
               </w:rPr>
-              <w:t>Psychological Cue</w:t>
+              <w:t>Boundary Isolation</w:t>
             </w:r>
           </w:p>
         </w:tc>
@@ -7570,7 +7570,7 @@
                 <w:color w:val="334155"/>
                 <w:sz w:val="18"/>
               </w:rPr>
-              <w:t>Dynamic searching hesitation vs Curious steady focus</w:t>
+              <w:t>Auto-resets to alpha 0.0 before Surprise begins</w:t>
             </w:r>
           </w:p>
         </w:tc>
@@ -11325,7 +11325,7 @@
           <w:color w:val="0F172A"/>
           <w:sz w:val="28"/>
         </w:rPr>
-        <w:t>14. Thinking (Contemplative Gaze Drift) (5.0s)</w:t>
+        <w:t>14. Thinking (Contemplative Gaze Drift &amp; Thought Cloud) (5.0s)</w:t>
       </w:r>
     </w:p>
     <w:p>
@@ -11379,7 +11379,7 @@
           <w:color w:val="64748B"/>
           <w:sz w:val="17"/>
         </w:rPr>
-        <w:t>Figure 15: Live V3 Render — Thinking (Contemplative Gaze Drift) (800x480 native resolution).</w:t>
+        <w:t>Figure 15: Live V3 Render — Thinking (Contemplative Gaze Drift &amp; Thought Cloud) (800x480 native resolution).</w:t>
       </w:r>
     </w:p>
     <w:p>
@@ -11411,7 +11411,7 @@
         <w:rPr>
           <w:color w:val="334155"/>
         </w:rPr>
-        <w:t>Eyes cast into a thoughtful upward-and-sideways gaze drift (dx = +23.3 px, dy = -33.6 px). Eyelids narrow into a deliberate contemplative half-squint (o = 0.40) while subtle harmonic drift (4.0 px sine at 0.4 Hz) suggests active cognitive calculation.</w:t>
+        <w:t>Eyes cast into a thoughtful upward-and-sideways gaze drift (dx = +23.3 px, dy = -33.6 px) with a minimalist geometric thought cloud floating above them performing a slow contemplative bob. Two trailing thought-bubble dots emerge first from the eye line (staggered scaling/fade-in), followed by the fluffy 6-lobe white cloud gathering at full scale and opacity. Eyelids narrow into a deliberate contemplative half-squint (o = 0.40) while subtle harmonic drift (4.0 px sine at 0.4 Hz) suggests active cognitive calculation. The cloud and bubbles dissolve cleanly at segment completion with zero boundary leakage.</w:t>
       </w:r>
     </w:p>
     <w:tbl>
@@ -11525,7 +11525,7 @@
                 <w:color w:val="1E293B"/>
                 <w:sz w:val="18"/>
               </w:rPr>
-              <w:t>Eyelid Squint</w:t>
+              <w:t>Thought Cloud Geometry</w:t>
             </w:r>
           </w:p>
         </w:tc>
@@ -11558,7 +11558,7 @@
                 <w:color w:val="334155"/>
                 <w:sz w:val="18"/>
               </w:rPr>
-              <w:t>o = 0.40 (Deliberate half-squint)</w:t>
+              <w:t>6 overlapping circular lobes (base radius 22 px) centered at (475, 88)</w:t>
             </w:r>
           </w:p>
         </w:tc>
@@ -11594,7 +11594,7 @@
                 <w:color w:val="1E293B"/>
                 <w:sz w:val="18"/>
               </w:rPr>
-              <w:t>Gaze Vector</w:t>
+              <w:t>Trailing Bubbles</w:t>
             </w:r>
           </w:p>
         </w:tc>
@@ -11627,7 +11627,7 @@
                 <w:color w:val="334155"/>
                 <w:sz w:val="18"/>
               </w:rPr>
-              <w:t>dx = +23.3 px, dy = -33.6 px (Up-Right)</w:t>
+              <w:t>2 dots: lower r=4px (+38,+68), upper r=6.5px (+22,+38) relative to cloud center</w:t>
             </w:r>
           </w:p>
         </w:tc>
@@ -11663,7 +11663,7 @@
                 <w:color w:val="1E293B"/>
                 <w:sz w:val="18"/>
               </w:rPr>
-              <w:t>Cognitive Micro-Drift</w:t>
+              <w:t>Emergence Sequence</w:t>
             </w:r>
           </w:p>
         </w:tc>
@@ -11696,7 +11696,7 @@
                 <w:color w:val="334155"/>
                 <w:sz w:val="18"/>
               </w:rPr>
-              <w:t>4.0 px lateral sway at 0.4 Hz</w:t>
+              <w:t>Bubble 1 (u~0.02) -&gt; Bubble 2 (u~0.06) -&gt; Main Cloud (u~0.10) -&gt; Hold -&gt; Staggered dissolve</w:t>
             </w:r>
           </w:p>
         </w:tc>
@@ -11732,7 +11732,7 @@
                 <w:color w:val="1E293B"/>
                 <w:sz w:val="18"/>
               </w:rPr>
-              <w:t>Scale Multiplier</w:t>
+              <w:t>Floating Bob</w:t>
             </w:r>
           </w:p>
         </w:tc>
@@ -11765,7 +11765,7 @@
                 <w:color w:val="334155"/>
                 <w:sz w:val="18"/>
               </w:rPr>
-              <w:t>1.00x (Neutral)</w:t>
+              <w:t>+/-3.0 px gentle sine float at 2.4s period during active phase</w:t>
             </w:r>
           </w:p>
         </w:tc>
@@ -11801,7 +11801,7 @@
                 <w:color w:val="1E293B"/>
                 <w:sz w:val="18"/>
               </w:rPr>
-              <w:t>Distinction from Curious</w:t>
+              <w:t>Eyelid Squint</w:t>
             </w:r>
           </w:p>
         </w:tc>
@@ -11834,7 +11834,145 @@
                 <w:color w:val="334155"/>
                 <w:sz w:val="18"/>
               </w:rPr>
-              <w:t>Upward drift (dy=-34 vs -10) + bilateral narrow (0.40 vs 1.0/0.82)</w:t>
+              <w:t>o = 0.40 (Deliberate half-squint)</w:t>
+            </w:r>
+          </w:p>
+        </w:tc>
+      </w:tr>
+      <w:tr>
+        <w:tc>
+          <w:tcPr>
+            <w:tcW w:type="dxa" w:w="3600"/>
+            <w:shd w:fill="F8FAFC"/>
+            <w:tcMar>
+              <w:top w:w="100" w:type="dxa"/>
+              <w:bottom w:w="100" w:type="dxa"/>
+              <w:left w:w="140" w:type="dxa"/>
+              <w:right w:w="140" w:type="dxa"/>
+            </w:tcMar>
+            <w:tcBorders>
+              <w:top w:val="none" w:sz="4" w:space="0" w:color="CBD5E1"/>
+              <w:bottom w:val="single" w:sz="4" w:space="0" w:color="CBD5E1"/>
+              <w:left w:val="none" w:sz="4" w:space="0" w:color="CBD5E1"/>
+              <w:right w:val="none" w:sz="4" w:space="0" w:color="CBD5E1"/>
+            </w:tcBorders>
+            <w:vAlign w:val="center"/>
+          </w:tcPr>
+          <w:p>
+            <w:pPr>
+              <w:spacing w:before="0" w:after="0" w:line="264" w:lineRule="auto"/>
+              <w:jc w:val="left"/>
+            </w:pPr>
+            <w:r>
+              <w:rPr>
+                <w:rFonts w:ascii="Segoe UI" w:hAnsi="Segoe UI"/>
+                <w:b/>
+                <w:color w:val="1E293B"/>
+                <w:sz w:val="18"/>
+              </w:rPr>
+              <w:t>Gaze Vector</w:t>
+            </w:r>
+          </w:p>
+        </w:tc>
+        <w:tc>
+          <w:tcPr>
+            <w:tcW w:type="dxa" w:w="6192"/>
+            <w:shd w:fill="F8FAFC"/>
+            <w:tcMar>
+              <w:top w:w="100" w:type="dxa"/>
+              <w:bottom w:w="100" w:type="dxa"/>
+              <w:left w:w="140" w:type="dxa"/>
+              <w:right w:w="140" w:type="dxa"/>
+            </w:tcMar>
+            <w:tcBorders>
+              <w:top w:val="none" w:sz="4" w:space="0" w:color="CBD5E1"/>
+              <w:bottom w:val="single" w:sz="4" w:space="0" w:color="CBD5E1"/>
+              <w:left w:val="none" w:sz="4" w:space="0" w:color="CBD5E1"/>
+              <w:right w:val="none" w:sz="4" w:space="0" w:color="CBD5E1"/>
+            </w:tcBorders>
+            <w:vAlign w:val="center"/>
+          </w:tcPr>
+          <w:p>
+            <w:pPr>
+              <w:spacing w:before="0" w:after="0" w:line="264" w:lineRule="auto"/>
+              <w:jc w:val="left"/>
+            </w:pPr>
+            <w:r>
+              <w:rPr>
+                <w:rFonts w:ascii="Consolas" w:hAnsi="Consolas"/>
+                <w:color w:val="334155"/>
+                <w:sz w:val="18"/>
+              </w:rPr>
+              <w:t>dx = +23.3 px, dy = -33.6 px (Up-Right)</w:t>
+            </w:r>
+          </w:p>
+        </w:tc>
+      </w:tr>
+      <w:tr>
+        <w:tc>
+          <w:tcPr>
+            <w:tcW w:type="dxa" w:w="3600"/>
+            <w:shd w:fill="FFFFFF"/>
+            <w:tcMar>
+              <w:top w:w="100" w:type="dxa"/>
+              <w:bottom w:w="100" w:type="dxa"/>
+              <w:left w:w="140" w:type="dxa"/>
+              <w:right w:w="140" w:type="dxa"/>
+            </w:tcMar>
+            <w:tcBorders>
+              <w:top w:val="none" w:sz="4" w:space="0" w:color="CBD5E1"/>
+              <w:bottom w:val="single" w:sz="4" w:space="0" w:color="CBD5E1"/>
+              <w:left w:val="none" w:sz="4" w:space="0" w:color="CBD5E1"/>
+              <w:right w:val="none" w:sz="4" w:space="0" w:color="CBD5E1"/>
+            </w:tcBorders>
+            <w:vAlign w:val="center"/>
+          </w:tcPr>
+          <w:p>
+            <w:pPr>
+              <w:spacing w:before="0" w:after="0" w:line="264" w:lineRule="auto"/>
+              <w:jc w:val="left"/>
+            </w:pPr>
+            <w:r>
+              <w:rPr>
+                <w:rFonts w:ascii="Segoe UI" w:hAnsi="Segoe UI"/>
+                <w:b/>
+                <w:color w:val="1E293B"/>
+                <w:sz w:val="18"/>
+              </w:rPr>
+              <w:t>Boundary Isolation</w:t>
+            </w:r>
+          </w:p>
+        </w:tc>
+        <w:tc>
+          <w:tcPr>
+            <w:tcW w:type="dxa" w:w="6192"/>
+            <w:shd w:fill="FFFFFF"/>
+            <w:tcMar>
+              <w:top w:w="100" w:type="dxa"/>
+              <w:bottom w:w="100" w:type="dxa"/>
+              <w:left w:w="140" w:type="dxa"/>
+              <w:right w:w="140" w:type="dxa"/>
+            </w:tcMar>
+            <w:tcBorders>
+              <w:top w:val="none" w:sz="4" w:space="0" w:color="CBD5E1"/>
+              <w:bottom w:val="single" w:sz="4" w:space="0" w:color="CBD5E1"/>
+              <w:left w:val="none" w:sz="4" w:space="0" w:color="CBD5E1"/>
+              <w:right w:val="none" w:sz="4" w:space="0" w:color="CBD5E1"/>
+            </w:tcBorders>
+            <w:vAlign w:val="center"/>
+          </w:tcPr>
+          <w:p>
+            <w:pPr>
+              <w:spacing w:before="0" w:after="0" w:line="264" w:lineRule="auto"/>
+              <w:jc w:val="left"/>
+            </w:pPr>
+            <w:r>
+              <w:rPr>
+                <w:rFonts w:ascii="Consolas" w:hAnsi="Consolas"/>
+                <w:color w:val="334155"/>
+                <w:sz w:val="18"/>
+              </w:rPr>
+              <w:t>Cloud &amp; bubbles auto-reset to alpha 0.0 before Suspicious begins</w:t>
             </w:r>
           </w:p>
         </w:tc>

</xml_diff>